<commit_message>
fix(assignment-05): correct Hadi et al. figure and lecture 11 wording in Q5
</commit_message>
<xml_diff>
--- a/assignments/05-assignment.docx
+++ b/assignments/05-assignment.docx
@@ -2482,7 +2482,7 @@
         <w:pStyle w:val="FirstParagraph"/>
       </w:pPr>
       <w:r>
-        <w:t xml:space="preserve">Lecture 11 presented three categories of real-world hallucination failures:</w:t>
+        <w:t xml:space="preserve">Lecture 11 discussed real-world hallucination failures:</w:t>
       </w:r>
       <w:r>
         <w:t xml:space="preserve"> </w:t>
@@ -2514,7 +2514,7 @@
         <w:t xml:space="preserve"> </w:t>
       </w:r>
       <w:r>
-        <w:t xml:space="preserve">(wrong drug advice; Hadi et al. 2024 found 51% of medical answers incorrect) and</w:t>
+        <w:t xml:space="preserve">(wrong medical advice; ChatGPT-3.5 got the diagnosis wrong in 51% of 150 clinical cases in Hadi et al. 2024) and</w:t>
       </w:r>
       <w:r>
         <w:t xml:space="preserve"> </w:t>

</xml_diff>

<commit_message>
fix(assignment-05): correct Q1 scoring and ask for word counts in Q3
</commit_message>
<xml_diff>
--- a/assignments/05-assignment.docx
+++ b/assignments/05-assignment.docx
@@ -807,7 +807,35 @@
         </w:numPr>
       </w:pPr>
       <w:r>
-        <w:t xml:space="preserve">Report the two scores out of six. For each check that Letter 1 failed, say which PTCF element supplied it in Letter 2</w:t>
+        <w:t xml:space="preserve">Report the two scores: Letter 1 out of five, Letter 2 out of six. Count a</w:t>
+      </w:r>
+      <w:r>
+        <w:t xml:space="preserve"> </w:t>
+      </w:r>
+      <w:r>
+        <w:rPr>
+          <w:b/>
+          <w:bCs/>
+        </w:rPr>
+        <w:t xml:space="preserve">“no”</w:t>
+      </w:r>
+      <w:r>
+        <w:t xml:space="preserve"> </w:t>
+      </w:r>
+      <w:r>
+        <w:t xml:space="preserve">in the</w:t>
+      </w:r>
+      <w:r>
+        <w:t xml:space="preserve"> </w:t>
+      </w:r>
+      <w:r>
+        <w:t xml:space="preserve">“not true”</w:t>
+      </w:r>
+      <w:r>
+        <w:t xml:space="preserve"> </w:t>
+      </w:r>
+      <w:r>
+        <w:t xml:space="preserve">row as a pass. For each check that Letter 1 failed, say which PTCF element supplied it in Letter 2</w:t>
       </w:r>
     </w:p>
     <w:p>
@@ -1636,7 +1664,7 @@
         <w:t xml:space="preserve">three new chats</w:t>
       </w:r>
       <w:r>
-        <w:t xml:space="preserve">. In the first, send V0 on its own, with nothing else: this is what the model gets when you skip the details. In the second, send V1 followed by the task description. In the third, send V2 followed by the task description. Copy the first 150 words of each output.</w:t>
+        <w:t xml:space="preserve">. In the first, send V0 on its own, with nothing else: this is what the model gets when you skip the details. In the second, send V1 followed by the task description. In the third, send V2 followed by the task description. Copy the first 150 words of each output, and note each output’s total word count.</w:t>
       </w:r>
     </w:p>
     <w:p>
@@ -4325,7 +4353,6 @@
     <w:link w:val="VerbatimChar"/>
     <w:pPr>
       <w:wordWrap w:val="off"/>
-      <w:shd w:val="clear" w:fill="f1f3f5"/>
     </w:pPr>
   </w:style>
   <w:style w:type="character" w:customStyle="1" w:styleId="KeywordTok">
@@ -4333,104 +4360,93 @@
     <w:basedOn w:val="VerbatimChar"/>
     <w:rPr>
       <w:b/>
-      <w:color w:val="003b4f"/>
-      <w:shd w:val="clear" w:fill="f1f3f5"/>
+      <w:color w:val="007020"/>
     </w:rPr>
   </w:style>
   <w:style w:type="character" w:customStyle="1" w:styleId="DataTypeTok">
     <w:name w:val="DataTypeTok"/>
     <w:basedOn w:val="VerbatimChar"/>
     <w:rPr>
-      <w:color w:val="ad0000"/>
-      <w:shd w:val="clear" w:fill="f1f3f5"/>
+      <w:color w:val="902000"/>
     </w:rPr>
   </w:style>
   <w:style w:type="character" w:customStyle="1" w:styleId="DecValTok">
     <w:name w:val="DecValTok"/>
     <w:basedOn w:val="VerbatimChar"/>
     <w:rPr>
-      <w:color w:val="ad0000"/>
-      <w:shd w:val="clear" w:fill="f1f3f5"/>
+      <w:color w:val="40a070"/>
     </w:rPr>
   </w:style>
   <w:style w:type="character" w:customStyle="1" w:styleId="BaseNTok">
     <w:name w:val="BaseNTok"/>
     <w:basedOn w:val="VerbatimChar"/>
     <w:rPr>
-      <w:color w:val="ad0000"/>
-      <w:shd w:val="clear" w:fill="f1f3f5"/>
+      <w:color w:val="40a070"/>
     </w:rPr>
   </w:style>
   <w:style w:type="character" w:customStyle="1" w:styleId="FloatTok">
     <w:name w:val="FloatTok"/>
     <w:basedOn w:val="VerbatimChar"/>
     <w:rPr>
-      <w:color w:val="ad0000"/>
-      <w:shd w:val="clear" w:fill="f1f3f5"/>
+      <w:color w:val="40a070"/>
     </w:rPr>
   </w:style>
   <w:style w:type="character" w:customStyle="1" w:styleId="ConstantTok">
     <w:name w:val="ConstantTok"/>
     <w:basedOn w:val="VerbatimChar"/>
     <w:rPr>
-      <w:color w:val="8f5902"/>
-      <w:shd w:val="clear" w:fill="f1f3f5"/>
+      <w:color w:val="880000"/>
     </w:rPr>
   </w:style>
   <w:style w:type="character" w:customStyle="1" w:styleId="CharTok">
     <w:name w:val="CharTok"/>
     <w:basedOn w:val="VerbatimChar"/>
     <w:rPr>
-      <w:color w:val="20794d"/>
-      <w:shd w:val="clear" w:fill="f1f3f5"/>
+      <w:color w:val="4070a0"/>
     </w:rPr>
   </w:style>
   <w:style w:type="character" w:customStyle="1" w:styleId="SpecialCharTok">
     <w:name w:val="SpecialCharTok"/>
     <w:basedOn w:val="VerbatimChar"/>
     <w:rPr>
-      <w:color w:val="5e5e5e"/>
-      <w:shd w:val="clear" w:fill="f1f3f5"/>
+      <w:color w:val="4070a0"/>
     </w:rPr>
   </w:style>
   <w:style w:type="character" w:customStyle="1" w:styleId="StringTok">
     <w:name w:val="StringTok"/>
     <w:basedOn w:val="VerbatimChar"/>
     <w:rPr>
-      <w:color w:val="20794d"/>
-      <w:shd w:val="clear" w:fill="f1f3f5"/>
+      <w:color w:val="4070a0"/>
     </w:rPr>
   </w:style>
   <w:style w:type="character" w:customStyle="1" w:styleId="VerbatimStringTok">
     <w:name w:val="VerbatimStringTok"/>
     <w:basedOn w:val="VerbatimChar"/>
     <w:rPr>
-      <w:color w:val="20794d"/>
-      <w:shd w:val="clear" w:fill="f1f3f5"/>
+      <w:color w:val="4070a0"/>
     </w:rPr>
   </w:style>
   <w:style w:type="character" w:customStyle="1" w:styleId="SpecialStringTok">
     <w:name w:val="SpecialStringTok"/>
     <w:basedOn w:val="VerbatimChar"/>
     <w:rPr>
-      <w:color w:val="20794d"/>
-      <w:shd w:val="clear" w:fill="f1f3f5"/>
+      <w:color w:val="bb6688"/>
     </w:rPr>
   </w:style>
   <w:style w:type="character" w:customStyle="1" w:styleId="ImportTok">
     <w:name w:val="ImportTok"/>
     <w:basedOn w:val="VerbatimChar"/>
     <w:rPr>
-      <w:color w:val="00769e"/>
-      <w:shd w:val="clear" w:fill="f1f3f5"/>
+      <w:b/>
+      <w:color w:val="008000"/>
     </w:rPr>
   </w:style>
   <w:style w:type="character" w:customStyle="1" w:styleId="CommentTok">
     <w:name w:val="CommentTok"/>
     <w:basedOn w:val="VerbatimChar"/>
     <w:rPr>
-      <w:color w:val="5e5e5e"/>
-      <w:shd w:val="clear" w:fill="f1f3f5"/>
+      <w:i/>
+      <w:color w:val="60a0b0"/>
     </w:rPr>
   </w:style>
   <w:style w:type="character" w:customStyle="1" w:styleId="DocumentationTok">
@@ -4438,49 +4454,46 @@
     <w:basedOn w:val="VerbatimChar"/>
     <w:rPr>
       <w:i/>
-      <w:color w:val="5e5e5e"/>
-      <w:shd w:val="clear" w:fill="f1f3f5"/>
+      <w:color w:val="ba2121"/>
     </w:rPr>
   </w:style>
   <w:style w:type="character" w:customStyle="1" w:styleId="AnnotationTok">
     <w:name w:val="AnnotationTok"/>
     <w:basedOn w:val="VerbatimChar"/>
     <w:rPr>
-      <w:color w:val="5e5e5e"/>
-      <w:shd w:val="clear" w:fill="f1f3f5"/>
+      <w:b/>
+      <w:i/>
+      <w:color w:val="60a0b0"/>
     </w:rPr>
   </w:style>
   <w:style w:type="character" w:customStyle="1" w:styleId="CommentVarTok">
     <w:name w:val="CommentVarTok"/>
     <w:basedOn w:val="VerbatimChar"/>
     <w:rPr>
+      <w:b/>
       <w:i/>
-      <w:color w:val="5e5e5e"/>
-      <w:shd w:val="clear" w:fill="f1f3f5"/>
+      <w:color w:val="60a0b0"/>
     </w:rPr>
   </w:style>
   <w:style w:type="character" w:customStyle="1" w:styleId="OtherTok">
     <w:name w:val="OtherTok"/>
     <w:basedOn w:val="VerbatimChar"/>
     <w:rPr>
-      <w:color w:val="003b4f"/>
-      <w:shd w:val="clear" w:fill="f1f3f5"/>
+      <w:color w:val="007020"/>
     </w:rPr>
   </w:style>
   <w:style w:type="character" w:customStyle="1" w:styleId="FunctionTok">
     <w:name w:val="FunctionTok"/>
     <w:basedOn w:val="VerbatimChar"/>
     <w:rPr>
-      <w:color w:val="4758ab"/>
-      <w:shd w:val="clear" w:fill="f1f3f5"/>
+      <w:color w:val="06287e"/>
     </w:rPr>
   </w:style>
   <w:style w:type="character" w:customStyle="1" w:styleId="VariableTok">
     <w:name w:val="VariableTok"/>
     <w:basedOn w:val="VerbatimChar"/>
     <w:rPr>
-      <w:color w:val="111111"/>
-      <w:shd w:val="clear" w:fill="f1f3f5"/>
+      <w:color w:val="19177c"/>
     </w:rPr>
   </w:style>
   <w:style w:type="character" w:customStyle="1" w:styleId="ControlFlowTok">
@@ -4488,98 +4501,85 @@
     <w:basedOn w:val="VerbatimChar"/>
     <w:rPr>
       <w:b/>
-      <w:color w:val="003b4f"/>
-      <w:shd w:val="clear" w:fill="f1f3f5"/>
+      <w:color w:val="007020"/>
     </w:rPr>
   </w:style>
   <w:style w:type="character" w:customStyle="1" w:styleId="OperatorTok">
     <w:name w:val="OperatorTok"/>
     <w:basedOn w:val="VerbatimChar"/>
     <w:rPr>
-      <w:color w:val="5e5e5e"/>
-      <w:shd w:val="clear" w:fill="f1f3f5"/>
+      <w:color w:val="666666"/>
     </w:rPr>
   </w:style>
   <w:style w:type="character" w:customStyle="1" w:styleId="BuiltInTok">
     <w:name w:val="BuiltInTok"/>
     <w:basedOn w:val="VerbatimChar"/>
     <w:rPr>
-      <w:color w:val="003b4f"/>
-      <w:shd w:val="clear" w:fill="f1f3f5"/>
+      <w:color w:val="008000"/>
     </w:rPr>
   </w:style>
   <w:style w:type="character" w:customStyle="1" w:styleId="ExtensionTok">
     <w:name w:val="ExtensionTok"/>
     <w:basedOn w:val="VerbatimChar"/>
-    <w:rPr>
-      <w:color w:val="003b4f"/>
-      <w:shd w:val="clear" w:fill="f1f3f5"/>
-    </w:rPr>
+    <w:rPr/>
   </w:style>
   <w:style w:type="character" w:customStyle="1" w:styleId="PreprocessorTok">
     <w:name w:val="PreprocessorTok"/>
     <w:basedOn w:val="VerbatimChar"/>
     <w:rPr>
-      <w:color w:val="ad0000"/>
-      <w:shd w:val="clear" w:fill="f1f3f5"/>
+      <w:color w:val="bc7a00"/>
     </w:rPr>
   </w:style>
   <w:style w:type="character" w:customStyle="1" w:styleId="AttributeTok">
     <w:name w:val="AttributeTok"/>
     <w:basedOn w:val="VerbatimChar"/>
     <w:rPr>
-      <w:color w:val="657422"/>
-      <w:shd w:val="clear" w:fill="f1f3f5"/>
+      <w:color w:val="7d9029"/>
     </w:rPr>
   </w:style>
   <w:style w:type="character" w:customStyle="1" w:styleId="RegionMarkerTok">
     <w:name w:val="RegionMarkerTok"/>
     <w:basedOn w:val="VerbatimChar"/>
-    <w:rPr>
-      <w:color w:val="003b4f"/>
-      <w:shd w:val="clear" w:fill="f1f3f5"/>
-    </w:rPr>
+    <w:rPr/>
   </w:style>
   <w:style w:type="character" w:customStyle="1" w:styleId="InformationTok">
     <w:name w:val="InformationTok"/>
     <w:basedOn w:val="VerbatimChar"/>
     <w:rPr>
-      <w:color w:val="5e5e5e"/>
-      <w:shd w:val="clear" w:fill="f1f3f5"/>
+      <w:b/>
+      <w:i/>
+      <w:color w:val="60a0b0"/>
     </w:rPr>
   </w:style>
   <w:style w:type="character" w:customStyle="1" w:styleId="WarningTok">
     <w:name w:val="WarningTok"/>
     <w:basedOn w:val="VerbatimChar"/>
     <w:rPr>
+      <w:b/>
       <w:i/>
-      <w:color w:val="5e5e5e"/>
-      <w:shd w:val="clear" w:fill="f1f3f5"/>
+      <w:color w:val="60a0b0"/>
     </w:rPr>
   </w:style>
   <w:style w:type="character" w:customStyle="1" w:styleId="AlertTok">
     <w:name w:val="AlertTok"/>
     <w:basedOn w:val="VerbatimChar"/>
     <w:rPr>
-      <w:color w:val="ad0000"/>
-      <w:shd w:val="clear" w:fill="f1f3f5"/>
+      <w:b/>
+      <w:color w:val="ff0000"/>
     </w:rPr>
   </w:style>
   <w:style w:type="character" w:customStyle="1" w:styleId="ErrorTok">
     <w:name w:val="ErrorTok"/>
     <w:basedOn w:val="VerbatimChar"/>
     <w:rPr>
-      <w:color w:val="ad0000"/>
-      <w:shd w:val="clear" w:fill="f1f3f5"/>
+      <w:b/>
+      <w:color w:val="ff0000"/>
     </w:rPr>
   </w:style>
   <w:style w:type="character" w:customStyle="1" w:styleId="NormalTok">
     <w:name w:val="NormalTok"/>
     <w:basedOn w:val="VerbatimChar"/>
-    <w:rPr>
-      <w:color w:val="003b4f"/>
-      <w:shd w:val="clear" w:fill="f1f3f5"/>
-    </w:rPr>
+    <w:rPr/>
   </w:style>
 </w:styles>
 </file>

</xml_diff>

<commit_message>
fix(assignment-05): assign the law-student scenario in Q5
</commit_message>
<xml_diff>
--- a/assignments/05-assignment.docx
+++ b/assignments/05-assignment.docx
@@ -2582,7 +2582,19 @@
         </w:numPr>
       </w:pPr>
       <w:r>
-        <w:t xml:space="preserve">Pick ONE scenario:</w:t>
+        <w:t xml:space="preserve">Read this scenario: a law student submits a brief citing three fake court cases generated by ChatGPT</w:t>
+      </w:r>
+    </w:p>
+    <w:p>
+      <w:pPr>
+        <w:pStyle w:val="Compact"/>
+        <w:numPr>
+          <w:ilvl w:val="0"/>
+          <w:numId w:val="1011"/>
+        </w:numPr>
+      </w:pPr>
+      <w:r>
+        <w:t xml:space="preserve">Write 100-200 words answering:</w:t>
       </w:r>
     </w:p>
     <w:p>
@@ -2593,17 +2605,8 @@
           <w:numId w:val="1012"/>
         </w:numPr>
       </w:pPr>
-    </w:p>
-    <w:p>
-      <w:pPr>
-        <w:pStyle w:val="Compact"/>
-        <w:numPr>
-          <w:ilvl w:val="2"/>
-          <w:numId w:val="1013"/>
-        </w:numPr>
-      </w:pPr>
-      <w:r>
-        <w:t xml:space="preserve">A law student submits a brief citing three fake court cases generated by ChatGPT</w:t>
+      <w:r>
+        <w:t xml:space="preserve">Who is most responsible: the user, the AI company, or regulators? Pick one and defend it</w:t>
       </w:r>
     </w:p>
     <w:p>
@@ -2614,17 +2617,8 @@
           <w:numId w:val="1012"/>
         </w:numPr>
       </w:pPr>
-    </w:p>
-    <w:p>
-      <w:pPr>
-        <w:pStyle w:val="Compact"/>
-        <w:numPr>
-          <w:ilvl w:val="2"/>
-          <w:numId w:val="1014"/>
-        </w:numPr>
-      </w:pPr>
-      <w:r>
-        <w:t xml:space="preserve">A patient takes an incorrect medication dosage recommended by an AI chatbot</w:t>
+      <w:r>
+        <w:t xml:space="preserve">What single change would most likely have prevented the harm?</w:t>
       </w:r>
     </w:p>
     <w:p>
@@ -2633,63 +2627,6 @@
         <w:numPr>
           <w:ilvl w:val="1"/>
           <w:numId w:val="1012"/>
-        </w:numPr>
-      </w:pPr>
-    </w:p>
-    <w:p>
-      <w:pPr>
-        <w:pStyle w:val="Compact"/>
-        <w:numPr>
-          <w:ilvl w:val="2"/>
-          <w:numId w:val="1015"/>
-        </w:numPr>
-      </w:pPr>
-      <w:r>
-        <w:t xml:space="preserve">A university student submits an essay with five sources that do not exist</w:t>
-      </w:r>
-    </w:p>
-    <w:p>
-      <w:pPr>
-        <w:pStyle w:val="Compact"/>
-        <w:numPr>
-          <w:ilvl w:val="0"/>
-          <w:numId w:val="1011"/>
-        </w:numPr>
-      </w:pPr>
-      <w:r>
-        <w:t xml:space="preserve">Write 100-200 words answering:</w:t>
-      </w:r>
-    </w:p>
-    <w:p>
-      <w:pPr>
-        <w:pStyle w:val="Compact"/>
-        <w:numPr>
-          <w:ilvl w:val="1"/>
-          <w:numId w:val="1016"/>
-        </w:numPr>
-      </w:pPr>
-      <w:r>
-        <w:t xml:space="preserve">Who is most responsible: the user, the AI company, or regulators? Pick one and defend it</w:t>
-      </w:r>
-    </w:p>
-    <w:p>
-      <w:pPr>
-        <w:pStyle w:val="Compact"/>
-        <w:numPr>
-          <w:ilvl w:val="1"/>
-          <w:numId w:val="1016"/>
-        </w:numPr>
-      </w:pPr>
-      <w:r>
-        <w:t xml:space="preserve">What single change would most likely have prevented the harm?</w:t>
-      </w:r>
-    </w:p>
-    <w:p>
-      <w:pPr>
-        <w:pStyle w:val="Compact"/>
-        <w:numPr>
-          <w:ilvl w:val="1"/>
-          <w:numId w:val="1016"/>
         </w:numPr>
       </w:pPr>
       <w:r>
@@ -2817,7 +2754,7 @@
         <w:pStyle w:val="Compact"/>
         <w:numPr>
           <w:ilvl w:val="0"/>
-          <w:numId w:val="1017"/>
+          <w:numId w:val="1013"/>
         </w:numPr>
       </w:pPr>
       <w:r>
@@ -2829,7 +2766,7 @@
         <w:pStyle w:val="Compact"/>
         <w:numPr>
           <w:ilvl w:val="0"/>
-          <w:numId w:val="1017"/>
+          <w:numId w:val="1013"/>
         </w:numPr>
       </w:pPr>
       <w:r>
@@ -2841,7 +2778,7 @@
         <w:pStyle w:val="Compact"/>
         <w:numPr>
           <w:ilvl w:val="0"/>
-          <w:numId w:val="1017"/>
+          <w:numId w:val="1013"/>
         </w:numPr>
       </w:pPr>
       <w:r>
@@ -3184,261 +3121,6 @@
       <w:start w:val="1"/>
       <w:numFmt w:val="decimal"/>
       <w:lvlText w:val="%9."/>
-      <w:lvlJc w:val="left"/>
-      <w:pPr>
-        <w:ind w:left="6480" w:hanging="360"/>
-      </w:pPr>
-    </w:lvl>
-  </w:abstractNum>
-  <w:abstractNum w:abstractNumId="99731">
-    <w:nsid w:val="00A99731"/>
-    <w:multiLevelType w:val="multilevel"/>
-    <w:lvl w:ilvl="0">
-      <w:start w:val="1"/>
-      <w:numFmt w:val="lowerLetter"/>
-      <w:lvlText w:val="(%1)"/>
-      <w:lvlJc w:val="left"/>
-      <w:pPr>
-        <w:ind w:left="720" w:hanging="360"/>
-      </w:pPr>
-    </w:lvl>
-    <w:lvl w:ilvl="1">
-      <w:start w:val="1"/>
-      <w:numFmt w:val="lowerLetter"/>
-      <w:lvlText w:val="(%2)"/>
-      <w:lvlJc w:val="left"/>
-      <w:pPr>
-        <w:ind w:left="1440" w:hanging="360"/>
-      </w:pPr>
-    </w:lvl>
-    <w:lvl w:ilvl="2">
-      <w:start w:val="1"/>
-      <w:numFmt w:val="lowerLetter"/>
-      <w:lvlText w:val="(%3)"/>
-      <w:lvlJc w:val="left"/>
-      <w:pPr>
-        <w:ind w:left="2160" w:hanging="360"/>
-      </w:pPr>
-    </w:lvl>
-    <w:lvl w:ilvl="3">
-      <w:start w:val="1"/>
-      <w:numFmt w:val="lowerLetter"/>
-      <w:lvlText w:val="(%4)"/>
-      <w:lvlJc w:val="left"/>
-      <w:pPr>
-        <w:ind w:left="2880" w:hanging="360"/>
-      </w:pPr>
-    </w:lvl>
-    <w:lvl w:ilvl="4">
-      <w:start w:val="1"/>
-      <w:numFmt w:val="lowerLetter"/>
-      <w:lvlText w:val="(%5)"/>
-      <w:lvlJc w:val="left"/>
-      <w:pPr>
-        <w:ind w:left="3600" w:hanging="360"/>
-      </w:pPr>
-    </w:lvl>
-    <w:lvl w:ilvl="5">
-      <w:start w:val="1"/>
-      <w:numFmt w:val="lowerLetter"/>
-      <w:lvlText w:val="(%6)"/>
-      <w:lvlJc w:val="left"/>
-      <w:pPr>
-        <w:ind w:left="4320" w:hanging="360"/>
-      </w:pPr>
-    </w:lvl>
-    <w:lvl w:ilvl="6">
-      <w:start w:val="1"/>
-      <w:numFmt w:val="lowerLetter"/>
-      <w:lvlText w:val="(%7)"/>
-      <w:lvlJc w:val="left"/>
-      <w:pPr>
-        <w:ind w:left="5040" w:hanging="360"/>
-      </w:pPr>
-    </w:lvl>
-    <w:lvl w:ilvl="7">
-      <w:start w:val="1"/>
-      <w:numFmt w:val="lowerLetter"/>
-      <w:lvlText w:val="(%8)"/>
-      <w:lvlJc w:val="left"/>
-      <w:pPr>
-        <w:ind w:left="5760" w:hanging="360"/>
-      </w:pPr>
-    </w:lvl>
-    <w:lvl w:ilvl="8">
-      <w:start w:val="1"/>
-      <w:numFmt w:val="lowerLetter"/>
-      <w:lvlText w:val="(%9)"/>
-      <w:lvlJc w:val="left"/>
-      <w:pPr>
-        <w:ind w:left="6480" w:hanging="360"/>
-      </w:pPr>
-    </w:lvl>
-  </w:abstractNum>
-  <w:abstractNum w:abstractNumId="99732">
-    <w:nsid w:val="00A99732"/>
-    <w:multiLevelType w:val="multilevel"/>
-    <w:lvl w:ilvl="0">
-      <w:start w:val="2"/>
-      <w:numFmt w:val="lowerLetter"/>
-      <w:lvlText w:val="(%1)"/>
-      <w:lvlJc w:val="left"/>
-      <w:pPr>
-        <w:ind w:left="720" w:hanging="360"/>
-      </w:pPr>
-    </w:lvl>
-    <w:lvl w:ilvl="1">
-      <w:start w:val="2"/>
-      <w:numFmt w:val="lowerLetter"/>
-      <w:lvlText w:val="(%2)"/>
-      <w:lvlJc w:val="left"/>
-      <w:pPr>
-        <w:ind w:left="1440" w:hanging="360"/>
-      </w:pPr>
-    </w:lvl>
-    <w:lvl w:ilvl="2">
-      <w:start w:val="2"/>
-      <w:numFmt w:val="lowerLetter"/>
-      <w:lvlText w:val="(%3)"/>
-      <w:lvlJc w:val="left"/>
-      <w:pPr>
-        <w:ind w:left="2160" w:hanging="360"/>
-      </w:pPr>
-    </w:lvl>
-    <w:lvl w:ilvl="3">
-      <w:start w:val="2"/>
-      <w:numFmt w:val="lowerLetter"/>
-      <w:lvlText w:val="(%4)"/>
-      <w:lvlJc w:val="left"/>
-      <w:pPr>
-        <w:ind w:left="2880" w:hanging="360"/>
-      </w:pPr>
-    </w:lvl>
-    <w:lvl w:ilvl="4">
-      <w:start w:val="2"/>
-      <w:numFmt w:val="lowerLetter"/>
-      <w:lvlText w:val="(%5)"/>
-      <w:lvlJc w:val="left"/>
-      <w:pPr>
-        <w:ind w:left="3600" w:hanging="360"/>
-      </w:pPr>
-    </w:lvl>
-    <w:lvl w:ilvl="5">
-      <w:start w:val="2"/>
-      <w:numFmt w:val="lowerLetter"/>
-      <w:lvlText w:val="(%6)"/>
-      <w:lvlJc w:val="left"/>
-      <w:pPr>
-        <w:ind w:left="4320" w:hanging="360"/>
-      </w:pPr>
-    </w:lvl>
-    <w:lvl w:ilvl="6">
-      <w:start w:val="2"/>
-      <w:numFmt w:val="lowerLetter"/>
-      <w:lvlText w:val="(%7)"/>
-      <w:lvlJc w:val="left"/>
-      <w:pPr>
-        <w:ind w:left="5040" w:hanging="360"/>
-      </w:pPr>
-    </w:lvl>
-    <w:lvl w:ilvl="7">
-      <w:start w:val="2"/>
-      <w:numFmt w:val="lowerLetter"/>
-      <w:lvlText w:val="(%8)"/>
-      <w:lvlJc w:val="left"/>
-      <w:pPr>
-        <w:ind w:left="5760" w:hanging="360"/>
-      </w:pPr>
-    </w:lvl>
-    <w:lvl w:ilvl="8">
-      <w:start w:val="2"/>
-      <w:numFmt w:val="lowerLetter"/>
-      <w:lvlText w:val="(%9)"/>
-      <w:lvlJc w:val="left"/>
-      <w:pPr>
-        <w:ind w:left="6480" w:hanging="360"/>
-      </w:pPr>
-    </w:lvl>
-  </w:abstractNum>
-  <w:abstractNum w:abstractNumId="99733">
-    <w:nsid w:val="00A99733"/>
-    <w:multiLevelType w:val="multilevel"/>
-    <w:lvl w:ilvl="0">
-      <w:start w:val="3"/>
-      <w:numFmt w:val="lowerLetter"/>
-      <w:lvlText w:val="(%1)"/>
-      <w:lvlJc w:val="left"/>
-      <w:pPr>
-        <w:ind w:left="720" w:hanging="360"/>
-      </w:pPr>
-    </w:lvl>
-    <w:lvl w:ilvl="1">
-      <w:start w:val="3"/>
-      <w:numFmt w:val="lowerLetter"/>
-      <w:lvlText w:val="(%2)"/>
-      <w:lvlJc w:val="left"/>
-      <w:pPr>
-        <w:ind w:left="1440" w:hanging="360"/>
-      </w:pPr>
-    </w:lvl>
-    <w:lvl w:ilvl="2">
-      <w:start w:val="3"/>
-      <w:numFmt w:val="lowerLetter"/>
-      <w:lvlText w:val="(%3)"/>
-      <w:lvlJc w:val="left"/>
-      <w:pPr>
-        <w:ind w:left="2160" w:hanging="360"/>
-      </w:pPr>
-    </w:lvl>
-    <w:lvl w:ilvl="3">
-      <w:start w:val="3"/>
-      <w:numFmt w:val="lowerLetter"/>
-      <w:lvlText w:val="(%4)"/>
-      <w:lvlJc w:val="left"/>
-      <w:pPr>
-        <w:ind w:left="2880" w:hanging="360"/>
-      </w:pPr>
-    </w:lvl>
-    <w:lvl w:ilvl="4">
-      <w:start w:val="3"/>
-      <w:numFmt w:val="lowerLetter"/>
-      <w:lvlText w:val="(%5)"/>
-      <w:lvlJc w:val="left"/>
-      <w:pPr>
-        <w:ind w:left="3600" w:hanging="360"/>
-      </w:pPr>
-    </w:lvl>
-    <w:lvl w:ilvl="5">
-      <w:start w:val="3"/>
-      <w:numFmt w:val="lowerLetter"/>
-      <w:lvlText w:val="(%6)"/>
-      <w:lvlJc w:val="left"/>
-      <w:pPr>
-        <w:ind w:left="4320" w:hanging="360"/>
-      </w:pPr>
-    </w:lvl>
-    <w:lvl w:ilvl="6">
-      <w:start w:val="3"/>
-      <w:numFmt w:val="lowerLetter"/>
-      <w:lvlText w:val="(%7)"/>
-      <w:lvlJc w:val="left"/>
-      <w:pPr>
-        <w:ind w:left="5040" w:hanging="360"/>
-      </w:pPr>
-    </w:lvl>
-    <w:lvl w:ilvl="7">
-      <w:start w:val="3"/>
-      <w:numFmt w:val="lowerLetter"/>
-      <w:lvlText w:val="(%8)"/>
-      <w:lvlJc w:val="left"/>
-      <w:pPr>
-        <w:ind w:left="5760" w:hanging="360"/>
-      </w:pPr>
-    </w:lvl>
-    <w:lvl w:ilvl="8">
-      <w:start w:val="3"/>
-      <w:numFmt w:val="lowerLetter"/>
-      <w:lvlText w:val="(%9)"/>
       <w:lvlJc w:val="left"/>
       <w:pPr>
         <w:ind w:left="6480" w:hanging="360"/>
@@ -3593,99 +3275,6 @@
     <w:abstractNumId w:val="991"/>
   </w:num>
   <w:num w:numId="1013">
-    <w:abstractNumId w:val="99731"/>
-    <w:lvlOverride w:ilvl="0">
-      <w:startOverride w:val="1"/>
-    </w:lvlOverride>
-    <w:lvlOverride w:ilvl="1">
-      <w:startOverride w:val="1"/>
-    </w:lvlOverride>
-    <w:lvlOverride w:ilvl="2">
-      <w:startOverride w:val="1"/>
-    </w:lvlOverride>
-    <w:lvlOverride w:ilvl="3">
-      <w:startOverride w:val="1"/>
-    </w:lvlOverride>
-    <w:lvlOverride w:ilvl="4">
-      <w:startOverride w:val="1"/>
-    </w:lvlOverride>
-    <w:lvlOverride w:ilvl="5">
-      <w:startOverride w:val="1"/>
-    </w:lvlOverride>
-    <w:lvlOverride w:ilvl="6">
-      <w:startOverride w:val="1"/>
-    </w:lvlOverride>
-    <w:lvlOverride w:ilvl="7">
-      <w:startOverride w:val="1"/>
-    </w:lvlOverride>
-    <w:lvlOverride w:ilvl="8">
-      <w:startOverride w:val="1"/>
-    </w:lvlOverride>
-  </w:num>
-  <w:num w:numId="1014">
-    <w:abstractNumId w:val="99732"/>
-    <w:lvlOverride w:ilvl="0">
-      <w:startOverride w:val="2"/>
-    </w:lvlOverride>
-    <w:lvlOverride w:ilvl="1">
-      <w:startOverride w:val="2"/>
-    </w:lvlOverride>
-    <w:lvlOverride w:ilvl="2">
-      <w:startOverride w:val="2"/>
-    </w:lvlOverride>
-    <w:lvlOverride w:ilvl="3">
-      <w:startOverride w:val="2"/>
-    </w:lvlOverride>
-    <w:lvlOverride w:ilvl="4">
-      <w:startOverride w:val="2"/>
-    </w:lvlOverride>
-    <w:lvlOverride w:ilvl="5">
-      <w:startOverride w:val="2"/>
-    </w:lvlOverride>
-    <w:lvlOverride w:ilvl="6">
-      <w:startOverride w:val="2"/>
-    </w:lvlOverride>
-    <w:lvlOverride w:ilvl="7">
-      <w:startOverride w:val="2"/>
-    </w:lvlOverride>
-    <w:lvlOverride w:ilvl="8">
-      <w:startOverride w:val="2"/>
-    </w:lvlOverride>
-  </w:num>
-  <w:num w:numId="1015">
-    <w:abstractNumId w:val="99733"/>
-    <w:lvlOverride w:ilvl="0">
-      <w:startOverride w:val="3"/>
-    </w:lvlOverride>
-    <w:lvlOverride w:ilvl="1">
-      <w:startOverride w:val="3"/>
-    </w:lvlOverride>
-    <w:lvlOverride w:ilvl="2">
-      <w:startOverride w:val="3"/>
-    </w:lvlOverride>
-    <w:lvlOverride w:ilvl="3">
-      <w:startOverride w:val="3"/>
-    </w:lvlOverride>
-    <w:lvlOverride w:ilvl="4">
-      <w:startOverride w:val="3"/>
-    </w:lvlOverride>
-    <w:lvlOverride w:ilvl="5">
-      <w:startOverride w:val="3"/>
-    </w:lvlOverride>
-    <w:lvlOverride w:ilvl="6">
-      <w:startOverride w:val="3"/>
-    </w:lvlOverride>
-    <w:lvlOverride w:ilvl="7">
-      <w:startOverride w:val="3"/>
-    </w:lvlOverride>
-    <w:lvlOverride w:ilvl="8">
-      <w:startOverride w:val="3"/>
-    </w:lvlOverride>
-  </w:num>
-  <w:num w:numId="1016">
-    <w:abstractNumId w:val="991"/>
-  </w:num>
-  <w:num w:numId="1017">
     <w:abstractNumId w:val="991"/>
   </w:num>
 </w:numbering>

</xml_diff>